<commit_message>
Generando y optimizando gastos_carro_graficas_comparacion_interpretacion_representacion_n2_v1.Rmd
</commit_message>
<xml_diff>
--- a/Lab-Manjaro/01-S1-2024B/salida/gastos_carro_graficas_comparacion_interpretacion_representacion_n2_v1_1.docx
+++ b/Lab-Manjaro/01-S1-2024B/salida/gastos_carro_graficas_comparacion_interpretacion_representacion_n2_v1_1.docx
@@ -110,7 +110,7 @@
         <w:t xml:space="preserve">Porcentajes</w:t>
       </w:r>
     </w:p>
-    <w:bookmarkStart w:id="41" w:name="section"/>
+    <w:bookmarkStart w:id="39" w:name="section"/>
     <w:p>
       <w:pPr>
         <w:pStyle w:val="Heading1"/>
@@ -213,501 +213,27 @@
     <w:p>
       <w:pPr>
         <w:numPr>
-          <w:ilvl w:val="0"/>
-          <w:numId w:val="1001"/>
-        </w:numPr>
-      </w:pPr>
-      <w:r>
-        <w:rPr>
-          <w:b/>
-          <w:bCs/>
-        </w:rPr>
-        <w:t xml:space="preserve">Solución</w:t>
-      </w:r>
-      <w:r>
-        <w:br/>
-      </w:r>
-      <w:r>
-        <w:t xml:space="preserve">Para resolver este problema, necesitamos identificar qué tipo de gráfica permite comparar directamente los</w:t>
-      </w:r>
-      <w:r>
-        <w:t xml:space="preserve"> </w:t>
-      </w:r>
-      <w:r>
-        <w:rPr>
-          <w:b/>
-          <w:bCs/>
-        </w:rPr>
-        <w:t xml:space="preserve">gastos totales por semana</w:t>
-      </w:r>
-      <w:r>
-        <w:t xml:space="preserve">.</w:t>
-      </w:r>
-    </w:p>
-    <w:p>
-      <w:pPr>
-        <w:pStyle w:val="Heading3"/>
-        <w:numPr>
-          <w:ilvl w:val="0"/>
-          <w:numId w:val="1000"/>
-        </w:numPr>
-      </w:pPr>
-      <w:bookmarkStart w:id="24" w:name="anuxe1lisis-de-los-datos"/>
-      <w:r>
-        <w:t xml:space="preserve">Análisis de los datos</w:t>
-      </w:r>
-      <w:bookmarkEnd w:id="24"/>
-    </w:p>
-    <w:p>
-      <w:pPr>
-        <w:numPr>
-          <w:ilvl w:val="0"/>
-          <w:numId w:val="1000"/>
-        </w:numPr>
-      </w:pPr>
-      <w:r>
-        <w:t xml:space="preserve">Primero, calculemos los gastos totales por semana:</w:t>
-      </w:r>
-    </w:p>
-    <w:p>
-      <w:pPr>
-        <w:numPr>
           <w:ilvl w:val="1"/>
-          <w:numId w:val="1003"/>
-        </w:numPr>
-      </w:pPr>
-      <w:r>
-        <w:rPr>
-          <w:b/>
-          <w:bCs/>
-        </w:rPr>
-        <w:t xml:space="preserve">Semana 1:</w:t>
-      </w:r>
-      <w:r>
-        <w:t xml:space="preserve"> </w:t>
-      </w:r>
-      <w:r>
-        <w:t xml:space="preserve">$37.000 + $18.000 + $11.000 = $66.000</w:t>
-      </w:r>
-    </w:p>
-    <w:p>
-      <w:pPr>
-        <w:numPr>
-          <w:ilvl w:val="1"/>
-          <w:numId w:val="1003"/>
-        </w:numPr>
-      </w:pPr>
-      <w:r>
-        <w:rPr>
-          <w:b/>
-          <w:bCs/>
-        </w:rPr>
-        <w:t xml:space="preserve">Semana 2:</w:t>
-      </w:r>
-      <w:r>
-        <w:t xml:space="preserve"> </w:t>
-      </w:r>
-      <w:r>
-        <w:t xml:space="preserve">$26.000 + $29.000 + $13.000 = $68.000</w:t>
-      </w:r>
-    </w:p>
-    <w:p>
-      <w:pPr>
-        <w:numPr>
-          <w:ilvl w:val="1"/>
-          <w:numId w:val="1003"/>
-        </w:numPr>
-      </w:pPr>
-      <w:r>
-        <w:rPr>
-          <w:b/>
-          <w:bCs/>
-        </w:rPr>
-        <w:t xml:space="preserve">Semana 3:</w:t>
-      </w:r>
-      <w:r>
-        <w:t xml:space="preserve"> </w:t>
-      </w:r>
-      <w:r>
-        <w:t xml:space="preserve">$28.000 + $19.000 + $12.000 = $59.000</w:t>
-      </w:r>
-    </w:p>
-    <w:p>
-      <w:pPr>
-        <w:numPr>
-          <w:ilvl w:val="1"/>
-          <w:numId w:val="1003"/>
-        </w:numPr>
-      </w:pPr>
-      <w:r>
-        <w:rPr>
-          <w:b/>
-          <w:bCs/>
-        </w:rPr>
-        <w:t xml:space="preserve">Semana 4:</w:t>
-      </w:r>
-      <w:r>
-        <w:t xml:space="preserve"> </w:t>
-      </w:r>
-      <w:r>
-        <w:t xml:space="preserve">$36.000 + $21.000 + $8.000 = $65.000</w:t>
-      </w:r>
-    </w:p>
-    <w:p>
-      <w:pPr>
-        <w:pStyle w:val="Heading3"/>
-        <w:numPr>
-          <w:ilvl w:val="0"/>
-          <w:numId w:val="1000"/>
-        </w:numPr>
-      </w:pPr>
-      <w:bookmarkStart w:id="25" w:name="anuxe1lisis-de-cada-opciuxf3n"/>
-      <w:r>
-        <w:t xml:space="preserve">Análisis de cada opción</w:t>
-      </w:r>
-      <w:bookmarkEnd w:id="25"/>
-    </w:p>
-    <w:p>
-      <w:pPr>
-        <w:numPr>
-          <w:ilvl w:val="0"/>
-          <w:numId w:val="1000"/>
-        </w:numPr>
-      </w:pPr>
-      <w:r>
-        <w:rPr>
-          <w:b/>
-          <w:bCs/>
-        </w:rPr>
-        <w:t xml:space="preserve">Gráfica circular por categoría:</w:t>
-      </w:r>
-    </w:p>
-    <w:p>
-      <w:pPr>
-        <w:numPr>
-          <w:ilvl w:val="1"/>
-          <w:numId w:val="1004"/>
-        </w:numPr>
-      </w:pPr>
-      <w:r>
-        <w:t xml:space="preserve">Muestra la proporción de cada tipo de gasto en el total general</w:t>
-      </w:r>
-    </w:p>
-    <w:p>
-      <w:pPr>
-        <w:numPr>
-          <w:ilvl w:val="1"/>
-          <w:numId w:val="1004"/>
-        </w:numPr>
-      </w:pPr>
-      <w:r>
-        <w:t xml:space="preserve">NO permite comparar gastos totales por semana</w:t>
-      </w:r>
-    </w:p>
-    <w:p>
-      <w:pPr>
-        <w:numPr>
-          <w:ilvl w:val="0"/>
-          <w:numId w:val="1000"/>
-        </w:numPr>
-      </w:pPr>
-      <w:r>
-        <w:rPr>
-          <w:b/>
-          <w:bCs/>
-        </w:rPr>
-        <w:t xml:space="preserve">Gráfica de barras apiladas por semana:</w:t>
-      </w:r>
-    </w:p>
-    <w:p>
-      <w:pPr>
-        <w:numPr>
-          <w:ilvl w:val="1"/>
-          <w:numId w:val="1005"/>
-        </w:numPr>
-      </w:pPr>
-      <w:r>
-        <w:t xml:space="preserve">Cada barra representa una semana</w:t>
-      </w:r>
-    </w:p>
-    <w:p>
-      <w:pPr>
-        <w:numPr>
-          <w:ilvl w:val="1"/>
-          <w:numId w:val="1005"/>
-        </w:numPr>
-      </w:pPr>
-      <w:r>
-        <w:t xml:space="preserve">La altura total de cada barra muestra el gasto total de esa semana</w:t>
-      </w:r>
-    </w:p>
-    <w:p>
-      <w:pPr>
-        <w:numPr>
-          <w:ilvl w:val="1"/>
-          <w:numId w:val="1005"/>
-        </w:numPr>
-      </w:pPr>
-      <w:r>
-        <w:t xml:space="preserve">Permite comparar directamente los gastos totales entre semanas</w:t>
-      </w:r>
-    </w:p>
-    <w:p>
-      <w:pPr>
-        <w:numPr>
-          <w:ilvl w:val="1"/>
-          <w:numId w:val="1005"/>
-        </w:numPr>
-      </w:pPr>
-      <w:r>
-        <w:rPr>
-          <w:b/>
-          <w:bCs/>
-        </w:rPr>
-        <w:t xml:space="preserve">Esta es la respuesta correcta</w:t>
-      </w:r>
-    </w:p>
-    <w:p>
-      <w:pPr>
-        <w:numPr>
-          <w:ilvl w:val="0"/>
-          <w:numId w:val="1000"/>
-        </w:numPr>
-      </w:pPr>
-      <w:r>
-        <w:rPr>
-          <w:b/>
-          <w:bCs/>
-        </w:rPr>
-        <w:t xml:space="preserve">Gráfica circular por semana:</w:t>
-      </w:r>
-    </w:p>
-    <w:p>
-      <w:pPr>
-        <w:numPr>
-          <w:ilvl w:val="1"/>
-          <w:numId w:val="1006"/>
-        </w:numPr>
-      </w:pPr>
-      <w:r>
-        <w:t xml:space="preserve">Muestra la proporción de gastos de cada semana respecto al total del mes</w:t>
-      </w:r>
-    </w:p>
-    <w:p>
-      <w:pPr>
-        <w:numPr>
-          <w:ilvl w:val="1"/>
-          <w:numId w:val="1006"/>
-        </w:numPr>
-      </w:pPr>
-      <w:r>
-        <w:t xml:space="preserve">No muestra los valores absolutos de cada semana claramente</w:t>
-      </w:r>
-    </w:p>
-    <w:p>
-      <w:pPr>
-        <w:numPr>
-          <w:ilvl w:val="0"/>
-          <w:numId w:val="1000"/>
-        </w:numPr>
-      </w:pPr>
-      <w:r>
-        <w:rPr>
-          <w:b/>
-          <w:bCs/>
-        </w:rPr>
-        <w:t xml:space="preserve">Gráfica de barras agrupadas por categoría:</w:t>
-      </w:r>
-    </w:p>
-    <w:p>
-      <w:pPr>
-        <w:numPr>
-          <w:ilvl w:val="1"/>
-          <w:numId w:val="1007"/>
-        </w:numPr>
-      </w:pPr>
-      <w:r>
-        <w:t xml:space="preserve">Agrupa las barras por tipo de gasto (gasolina, parqueadero, peajes)</w:t>
-      </w:r>
-    </w:p>
-    <w:p>
-      <w:pPr>
-        <w:numPr>
-          <w:ilvl w:val="1"/>
-          <w:numId w:val="1007"/>
-        </w:numPr>
-      </w:pPr>
-      <w:r>
-        <w:t xml:space="preserve">Dificulta la comparación de gastos totales por semana</w:t>
-      </w:r>
-    </w:p>
-    <w:p>
-      <w:pPr>
-        <w:pStyle w:val="Heading3"/>
-        <w:numPr>
-          <w:ilvl w:val="0"/>
-          <w:numId w:val="1000"/>
-        </w:numPr>
-      </w:pPr>
-      <w:bookmarkStart w:id="26" w:name="conclusiuxf3n"/>
-      <w:r>
-        <w:t xml:space="preserve">Conclusión</w:t>
-      </w:r>
-      <w:bookmarkEnd w:id="26"/>
-    </w:p>
-    <w:p>
-      <w:pPr>
-        <w:numPr>
-          <w:ilvl w:val="0"/>
-          <w:numId w:val="1000"/>
-        </w:numPr>
-      </w:pPr>
-      <w:r>
-        <w:t xml:space="preserve">La</w:t>
-      </w:r>
-      <w:r>
-        <w:t xml:space="preserve"> </w:t>
-      </w:r>
-      <w:r>
-        <w:rPr>
-          <w:b/>
-          <w:bCs/>
-        </w:rPr>
-        <w:t xml:space="preserve">Opción</w:t>
-      </w:r>
-      <w:r>
-        <w:rPr>
-          <w:b/>
-          <w:bCs/>
-        </w:rPr>
-        <w:t xml:space="preserve"> </w:t>
-      </w:r>
-      <w:r>
-        <w:rPr>
-          <w:b/>
-          <w:bCs/>
-        </w:rPr>
-        <w:t xml:space="preserve">“</w:t>
-      </w:r>
-      <w:r>
-        <w:rPr>
-          <w:b/>
-          <w:bCs/>
-        </w:rPr>
-        <w:t xml:space="preserve">gráfica de barras apiladas por semana</w:t>
-      </w:r>
-      <w:r>
-        <w:rPr>
-          <w:b/>
-          <w:bCs/>
-        </w:rPr>
-        <w:t xml:space="preserve">”</w:t>
-      </w:r>
-      <w:r>
-        <w:t xml:space="preserve"> </w:t>
-      </w:r>
-      <w:r>
-        <w:t xml:space="preserve">es la única que permite comparar directamente los gastos totales por semana, ya que la altura de cada barra representa el gasto total de cada semana.</w:t>
-      </w:r>
-    </w:p>
-    <w:p>
-      <w:pPr>
-        <w:numPr>
-          <w:ilvl w:val="1"/>
-          <w:numId w:val="1008"/>
-        </w:numPr>
-      </w:pPr>
-      <w:r>
-        <w:t xml:space="preserve">Verdadero</w:t>
-      </w:r>
-    </w:p>
-    <w:p>
-      <w:pPr>
-        <w:numPr>
-          <w:ilvl w:val="1"/>
-          <w:numId w:val="1008"/>
-        </w:numPr>
-      </w:pPr>
-      <w:r>
-        <w:t xml:space="preserve">Falso</w:t>
-      </w:r>
-    </w:p>
-    <w:p>
-      <w:pPr>
-        <w:numPr>
-          <w:ilvl w:val="1"/>
-          <w:numId w:val="1008"/>
-        </w:numPr>
-      </w:pPr>
-      <w:r>
-        <w:t xml:space="preserve">Falso</w:t>
-      </w:r>
-    </w:p>
-    <w:p>
-      <w:pPr>
-        <w:numPr>
-          <w:ilvl w:val="1"/>
-          <w:numId w:val="1008"/>
-        </w:numPr>
-      </w:pPr>
-      <w:r>
-        <w:t xml:space="preserve">Falso</w:t>
-      </w:r>
-    </w:p>
-    <w:p>
-      <w:pPr>
-        <w:numPr>
-          <w:ilvl w:val="0"/>
-          <w:numId w:val="1001"/>
-        </w:numPr>
-      </w:pPr>
-      <w:r>
-        <w:rPr>
-          <w:b/>
-          <w:bCs/>
-        </w:rPr>
-        <w:t xml:space="preserve">Escenario</w:t>
-      </w:r>
-      <w:r>
-        <w:br/>
-      </w:r>
-      <w:r>
-        <w:t xml:space="preserve">La tabla muestra el registro semanal que lleva una persona de los gastos relacionados con su automóvil.</w:t>
-      </w:r>
-    </w:p>
-    <w:p>
-      <w:pPr>
-        <w:numPr>
-          <w:ilvl w:val="0"/>
-          <w:numId w:val="1000"/>
+          <w:numId w:val="1002"/>
         </w:numPr>
       </w:pPr>
       <w:r>
         <w:drawing>
           <wp:inline>
-            <wp:extent cx="3599999" cy="880219"/>
+            <wp:extent cx="3733800" cy="3892497"/>
             <wp:effectExtent b="0" l="0" r="0" t="0"/>
-            <wp:docPr descr="image" title="" id="28" name="Picture"/>
+            <wp:docPr descr="image" title="" id="25" name="Picture"/>
             <a:graphic>
               <a:graphicData uri="http://schemas.openxmlformats.org/drawingml/2006/picture">
                 <pic:pic>
                   <pic:nvPicPr>
-                    <pic:cNvPr descr="media/supplements1/exercise2/tabla_gastos.svg" id="29" name="Picture"/>
+                    <pic:cNvPr descr="media/supplements1/exercise1/grafica_c.png" id="26" name="Picture"/>
                     <pic:cNvPicPr>
                       <a:picLocks noChangeArrowheads="1" noChangeAspect="1"/>
                     </pic:cNvPicPr>
                   </pic:nvPicPr>
                   <pic:blipFill>
-                    <a:blip r:embed="rId30">
-                      <a:extLst>
-                        <a:ext uri="{28A0092B-C50C-407E-A947-70E740481C1C}">
-                          <a14:useLocalDpi xmlns:a14="http://schemas.microsoft.com/office/drawing/2010/main" val="0"/>
-                        </a:ext>
-                        <a:ext uri="{96DAC541-7B7A-43D3-8B79-37D633B846F1}">
-                          <asvg:svgBlip xmlns:asvg="http://schemas.microsoft.com/office/drawing/2016/SVG/main" r:embed="rId27"/>
-                        </a:ext>
-                      </a:extLst>
-                    </a:blip>
+                    <a:blip r:embed="rId24"/>
                     <a:stretch>
                       <a:fillRect/>
                     </a:stretch>
@@ -715,7 +241,7 @@
                   <pic:spPr bwMode="auto">
                     <a:xfrm>
                       <a:off x="0" y="0"/>
-                      <a:ext cx="3599999" cy="880219"/>
+                      <a:ext cx="3733800" cy="3892497"/>
                     </a:xfrm>
                     <a:prstGeom prst="rect">
                       <a:avLst/>
@@ -737,512 +263,27 @@
     <w:p>
       <w:pPr>
         <w:numPr>
-          <w:ilvl w:val="0"/>
-          <w:numId w:val="1000"/>
-        </w:numPr>
-      </w:pPr>
-      <w:r>
-        <w:t xml:space="preserve">Si la persona quiere realizar una comparación entre los gastos totales por semana, ¿cuál de las siguientes gráficas le permite hacer esto directamente?</w:t>
-      </w:r>
-    </w:p>
-    <w:p>
-      <w:pPr>
-        <w:numPr>
-          <w:ilvl w:val="0"/>
-          <w:numId w:val="1001"/>
-        </w:numPr>
-      </w:pPr>
-      <w:r>
-        <w:rPr>
-          <w:b/>
-          <w:bCs/>
-        </w:rPr>
-        <w:t xml:space="preserve">Solución</w:t>
-      </w:r>
-      <w:r>
-        <w:br/>
-      </w:r>
-      <w:r>
-        <w:t xml:space="preserve">Para resolver este problema, necesitamos identificar qué tipo de gráfica permite comparar directamente los</w:t>
-      </w:r>
-      <w:r>
-        <w:t xml:space="preserve"> </w:t>
-      </w:r>
-      <w:r>
-        <w:rPr>
-          <w:b/>
-          <w:bCs/>
-        </w:rPr>
-        <w:t xml:space="preserve">gastos totales por semana</w:t>
-      </w:r>
-      <w:r>
-        <w:t xml:space="preserve">.</w:t>
-      </w:r>
-    </w:p>
-    <w:p>
-      <w:pPr>
-        <w:pStyle w:val="Heading3"/>
-        <w:numPr>
-          <w:ilvl w:val="0"/>
-          <w:numId w:val="1000"/>
-        </w:numPr>
-      </w:pPr>
-      <w:bookmarkStart w:id="31" w:name="anuxe1lisis-de-los-datos"/>
-      <w:r>
-        <w:t xml:space="preserve">Análisis de los datos</w:t>
-      </w:r>
-      <w:bookmarkEnd w:id="31"/>
-    </w:p>
-    <w:p>
-      <w:pPr>
-        <w:numPr>
-          <w:ilvl w:val="0"/>
-          <w:numId w:val="1000"/>
-        </w:numPr>
-      </w:pPr>
-      <w:r>
-        <w:t xml:space="preserve">Primero, calculemos los gastos totales por semana:</w:t>
-      </w:r>
-    </w:p>
-    <w:p>
-      <w:pPr>
-        <w:numPr>
           <w:ilvl w:val="1"/>
-          <w:numId w:val="1010"/>
-        </w:numPr>
-      </w:pPr>
-      <w:r>
-        <w:rPr>
-          <w:b/>
-          <w:bCs/>
-        </w:rPr>
-        <w:t xml:space="preserve">Semana 1:</w:t>
-      </w:r>
-      <w:r>
-        <w:t xml:space="preserve"> </w:t>
-      </w:r>
-      <w:r>
-        <w:t xml:space="preserve">$31.000 + $28.000 + $21.000 = $80.000</w:t>
-      </w:r>
-    </w:p>
-    <w:p>
-      <w:pPr>
-        <w:numPr>
-          <w:ilvl w:val="1"/>
-          <w:numId w:val="1010"/>
-        </w:numPr>
-      </w:pPr>
-      <w:r>
-        <w:rPr>
-          <w:b/>
-          <w:bCs/>
-        </w:rPr>
-        <w:t xml:space="preserve">Semana 2:</w:t>
-      </w:r>
-      <w:r>
-        <w:t xml:space="preserve"> </w:t>
-      </w:r>
-      <w:r>
-        <w:t xml:space="preserve">$38.000 + $17.000 + $13.000 = $68.000</w:t>
-      </w:r>
-    </w:p>
-    <w:p>
-      <w:pPr>
-        <w:numPr>
-          <w:ilvl w:val="1"/>
-          <w:numId w:val="1010"/>
-        </w:numPr>
-      </w:pPr>
-      <w:r>
-        <w:rPr>
-          <w:b/>
-          <w:bCs/>
-        </w:rPr>
-        <w:t xml:space="preserve">Semana 3:</w:t>
-      </w:r>
-      <w:r>
-        <w:t xml:space="preserve"> </w:t>
-      </w:r>
-      <w:r>
-        <w:t xml:space="preserve">$35.000 + $26.000 + $16.000 = $77.000</w:t>
-      </w:r>
-    </w:p>
-    <w:p>
-      <w:pPr>
-        <w:numPr>
-          <w:ilvl w:val="1"/>
-          <w:numId w:val="1010"/>
-        </w:numPr>
-      </w:pPr>
-      <w:r>
-        <w:rPr>
-          <w:b/>
-          <w:bCs/>
-        </w:rPr>
-        <w:t xml:space="preserve">Semana 4:</w:t>
-      </w:r>
-      <w:r>
-        <w:t xml:space="preserve"> </w:t>
-      </w:r>
-      <w:r>
-        <w:t xml:space="preserve">$30.000 + $18.000 + $12.000 = $60.000</w:t>
-      </w:r>
-    </w:p>
-    <w:p>
-      <w:pPr>
-        <w:pStyle w:val="Heading3"/>
-        <w:numPr>
-          <w:ilvl w:val="0"/>
-          <w:numId w:val="1000"/>
-        </w:numPr>
-      </w:pPr>
-      <w:bookmarkStart w:id="32" w:name="anuxe1lisis-de-cada-opciuxf3n"/>
-      <w:r>
-        <w:t xml:space="preserve">Análisis de cada opción</w:t>
-      </w:r>
-      <w:bookmarkEnd w:id="32"/>
-    </w:p>
-    <w:p>
-      <w:pPr>
-        <w:numPr>
-          <w:ilvl w:val="0"/>
-          <w:numId w:val="1000"/>
-        </w:numPr>
-      </w:pPr>
-      <w:r>
-        <w:rPr>
-          <w:b/>
-          <w:bCs/>
-        </w:rPr>
-        <w:t xml:space="preserve">Gráfica circular por categoría:</w:t>
-      </w:r>
-    </w:p>
-    <w:p>
-      <w:pPr>
-        <w:numPr>
-          <w:ilvl w:val="1"/>
-          <w:numId w:val="1011"/>
-        </w:numPr>
-      </w:pPr>
-      <w:r>
-        <w:t xml:space="preserve">Muestra la proporción de cada tipo de gasto en el total general</w:t>
-      </w:r>
-    </w:p>
-    <w:p>
-      <w:pPr>
-        <w:numPr>
-          <w:ilvl w:val="1"/>
-          <w:numId w:val="1011"/>
-        </w:numPr>
-      </w:pPr>
-      <w:r>
-        <w:t xml:space="preserve">NO permite comparar gastos totales por semana</w:t>
-      </w:r>
-    </w:p>
-    <w:p>
-      <w:pPr>
-        <w:numPr>
-          <w:ilvl w:val="0"/>
-          <w:numId w:val="1000"/>
-        </w:numPr>
-      </w:pPr>
-      <w:r>
-        <w:rPr>
-          <w:b/>
-          <w:bCs/>
-        </w:rPr>
-        <w:t xml:space="preserve">Gráfica de barras apiladas por semana:</w:t>
-      </w:r>
-    </w:p>
-    <w:p>
-      <w:pPr>
-        <w:numPr>
-          <w:ilvl w:val="1"/>
-          <w:numId w:val="1012"/>
-        </w:numPr>
-      </w:pPr>
-      <w:r>
-        <w:t xml:space="preserve">Cada barra representa una semana</w:t>
-      </w:r>
-    </w:p>
-    <w:p>
-      <w:pPr>
-        <w:numPr>
-          <w:ilvl w:val="1"/>
-          <w:numId w:val="1012"/>
-        </w:numPr>
-      </w:pPr>
-      <w:r>
-        <w:t xml:space="preserve">La altura total de cada barra muestra el gasto total de esa semana</w:t>
-      </w:r>
-    </w:p>
-    <w:p>
-      <w:pPr>
-        <w:numPr>
-          <w:ilvl w:val="1"/>
-          <w:numId w:val="1012"/>
-        </w:numPr>
-      </w:pPr>
-      <w:r>
-        <w:t xml:space="preserve">Permite comparar directamente los gastos totales entre semanas</w:t>
-      </w:r>
-    </w:p>
-    <w:p>
-      <w:pPr>
-        <w:numPr>
-          <w:ilvl w:val="1"/>
-          <w:numId w:val="1012"/>
-        </w:numPr>
-      </w:pPr>
-      <w:r>
-        <w:rPr>
-          <w:b/>
-          <w:bCs/>
-        </w:rPr>
-        <w:t xml:space="preserve">Esta es la respuesta correcta</w:t>
-      </w:r>
-    </w:p>
-    <w:p>
-      <w:pPr>
-        <w:numPr>
-          <w:ilvl w:val="0"/>
-          <w:numId w:val="1000"/>
-        </w:numPr>
-      </w:pPr>
-      <w:r>
-        <w:rPr>
-          <w:b/>
-          <w:bCs/>
-        </w:rPr>
-        <w:t xml:space="preserve">Gráfica circular por semana:</w:t>
-      </w:r>
-    </w:p>
-    <w:p>
-      <w:pPr>
-        <w:numPr>
-          <w:ilvl w:val="1"/>
-          <w:numId w:val="1013"/>
-        </w:numPr>
-      </w:pPr>
-      <w:r>
-        <w:t xml:space="preserve">Muestra la proporción de gastos de cada semana respecto al total del mes</w:t>
-      </w:r>
-    </w:p>
-    <w:p>
-      <w:pPr>
-        <w:numPr>
-          <w:ilvl w:val="1"/>
-          <w:numId w:val="1013"/>
-        </w:numPr>
-      </w:pPr>
-      <w:r>
-        <w:t xml:space="preserve">No muestra los valores absolutos de cada semana claramente</w:t>
-      </w:r>
-    </w:p>
-    <w:p>
-      <w:pPr>
-        <w:numPr>
-          <w:ilvl w:val="0"/>
-          <w:numId w:val="1000"/>
-        </w:numPr>
-      </w:pPr>
-      <w:r>
-        <w:rPr>
-          <w:b/>
-          <w:bCs/>
-        </w:rPr>
-        <w:t xml:space="preserve">Gráfica de barras agrupadas por categoría:</w:t>
-      </w:r>
-    </w:p>
-    <w:p>
-      <w:pPr>
-        <w:numPr>
-          <w:ilvl w:val="1"/>
-          <w:numId w:val="1014"/>
-        </w:numPr>
-      </w:pPr>
-      <w:r>
-        <w:t xml:space="preserve">Agrupa las barras por tipo de gasto (gasolina, parqueadero, peajes)</w:t>
-      </w:r>
-    </w:p>
-    <w:p>
-      <w:pPr>
-        <w:numPr>
-          <w:ilvl w:val="1"/>
-          <w:numId w:val="1014"/>
-        </w:numPr>
-      </w:pPr>
-      <w:r>
-        <w:t xml:space="preserve">Dificulta la comparación de gastos totales por semana</w:t>
-      </w:r>
-    </w:p>
-    <w:p>
-      <w:pPr>
-        <w:pStyle w:val="Heading3"/>
-        <w:numPr>
-          <w:ilvl w:val="0"/>
-          <w:numId w:val="1000"/>
-        </w:numPr>
-      </w:pPr>
-      <w:bookmarkStart w:id="33" w:name="conclusiuxf3n"/>
-      <w:r>
-        <w:t xml:space="preserve">Conclusión</w:t>
-      </w:r>
-      <w:bookmarkEnd w:id="33"/>
-    </w:p>
-    <w:p>
-      <w:pPr>
-        <w:numPr>
-          <w:ilvl w:val="0"/>
-          <w:numId w:val="1000"/>
-        </w:numPr>
-      </w:pPr>
-      <w:r>
-        <w:t xml:space="preserve">La</w:t>
-      </w:r>
-      <w:r>
-        <w:t xml:space="preserve"> </w:t>
-      </w:r>
-      <w:r>
-        <w:rPr>
-          <w:b/>
-          <w:bCs/>
-        </w:rPr>
-        <w:t xml:space="preserve">Opción</w:t>
-      </w:r>
-      <w:r>
-        <w:rPr>
-          <w:b/>
-          <w:bCs/>
-        </w:rPr>
-        <w:t xml:space="preserve"> </w:t>
-      </w:r>
-      <w:r>
-        <w:rPr>
-          <w:b/>
-          <w:bCs/>
-        </w:rPr>
-        <w:t xml:space="preserve">“</w:t>
-      </w:r>
-      <w:r>
-        <w:rPr>
-          <w:b/>
-          <w:bCs/>
-        </w:rPr>
-        <w:t xml:space="preserve">gráfica de barras apiladas por semana</w:t>
-      </w:r>
-      <w:r>
-        <w:rPr>
-          <w:b/>
-          <w:bCs/>
-        </w:rPr>
-        <w:t xml:space="preserve">”</w:t>
-      </w:r>
-      <w:r>
-        <w:t xml:space="preserve"> </w:t>
-      </w:r>
-      <w:r>
-        <w:t xml:space="preserve">es la única que permite comparar directamente los gastos totales por semana, ya que la altura de cada barra representa el gasto total de cada semana.</w:t>
-      </w:r>
-    </w:p>
-    <w:p>
-      <w:pPr>
-        <w:numPr>
-          <w:ilvl w:val="1"/>
-          <w:numId w:val="1015"/>
-        </w:numPr>
-      </w:pPr>
-      <w:r>
-        <w:t xml:space="preserve">Verdadero</w:t>
-      </w:r>
-    </w:p>
-    <w:p>
-      <w:pPr>
-        <w:numPr>
-          <w:ilvl w:val="1"/>
-          <w:numId w:val="1015"/>
-        </w:numPr>
-      </w:pPr>
-      <w:r>
-        <w:t xml:space="preserve">Falso</w:t>
-      </w:r>
-    </w:p>
-    <w:p>
-      <w:pPr>
-        <w:numPr>
-          <w:ilvl w:val="1"/>
-          <w:numId w:val="1015"/>
-        </w:numPr>
-      </w:pPr>
-      <w:r>
-        <w:t xml:space="preserve">Falso</w:t>
-      </w:r>
-    </w:p>
-    <w:p>
-      <w:pPr>
-        <w:numPr>
-          <w:ilvl w:val="1"/>
-          <w:numId w:val="1015"/>
-        </w:numPr>
-      </w:pPr>
-      <w:r>
-        <w:t xml:space="preserve">Falso</w:t>
-      </w:r>
-    </w:p>
-    <w:p>
-      <w:pPr>
-        <w:numPr>
-          <w:ilvl w:val="0"/>
-          <w:numId w:val="1001"/>
-        </w:numPr>
-      </w:pPr>
-      <w:r>
-        <w:rPr>
-          <w:b/>
-          <w:bCs/>
-        </w:rPr>
-        <w:t xml:space="preserve">Escenario</w:t>
-      </w:r>
-      <w:r>
-        <w:br/>
-      </w:r>
-      <w:r>
-        <w:t xml:space="preserve">La tabla muestra el registro semanal que lleva una persona de los gastos relacionados con su motocicleta.</w:t>
-      </w:r>
-    </w:p>
-    <w:p>
-      <w:pPr>
-        <w:numPr>
-          <w:ilvl w:val="0"/>
-          <w:numId w:val="1000"/>
+          <w:numId w:val="1002"/>
         </w:numPr>
       </w:pPr>
       <w:r>
         <w:drawing>
           <wp:inline>
-            <wp:extent cx="3599999" cy="880219"/>
+            <wp:extent cx="4800600" cy="2851265"/>
             <wp:effectExtent b="0" l="0" r="0" t="0"/>
-            <wp:docPr descr="image" title="" id="35" name="Picture"/>
+            <wp:docPr descr="image" title="" id="28" name="Picture"/>
             <a:graphic>
               <a:graphicData uri="http://schemas.openxmlformats.org/drawingml/2006/picture">
                 <pic:pic>
                   <pic:nvPicPr>
-                    <pic:cNvPr descr="media/supplements1/exercise3/tabla_gastos.svg" id="36" name="Picture"/>
+                    <pic:cNvPr descr="media/supplements1/exercise1/grafica_d.png" id="29" name="Picture"/>
                     <pic:cNvPicPr>
                       <a:picLocks noChangeArrowheads="1" noChangeAspect="1"/>
                     </pic:cNvPicPr>
                   </pic:nvPicPr>
                   <pic:blipFill>
-                    <a:blip r:embed="rId37">
-                      <a:extLst>
-                        <a:ext uri="{28A0092B-C50C-407E-A947-70E740481C1C}">
-                          <a14:useLocalDpi xmlns:a14="http://schemas.microsoft.com/office/drawing/2010/main" val="0"/>
-                        </a:ext>
-                        <a:ext uri="{96DAC541-7B7A-43D3-8B79-37D633B846F1}">
-                          <asvg:svgBlip xmlns:asvg="http://schemas.microsoft.com/office/drawing/2016/SVG/main" r:embed="rId34"/>
-                        </a:ext>
-                      </a:extLst>
-                    </a:blip>
+                    <a:blip r:embed="rId27"/>
                     <a:stretch>
                       <a:fillRect/>
                     </a:stretch>
@@ -1250,7 +291,7 @@
                   <pic:spPr bwMode="auto">
                     <a:xfrm>
                       <a:off x="0" y="0"/>
-                      <a:ext cx="3599999" cy="880219"/>
+                      <a:ext cx="4800600" cy="2851265"/>
                     </a:xfrm>
                     <a:prstGeom prst="rect">
                       <a:avLst/>
@@ -1272,19 +313,108 @@
     <w:p>
       <w:pPr>
         <w:numPr>
+          <w:ilvl w:val="1"/>
+          <w:numId w:val="1002"/>
+        </w:numPr>
+      </w:pPr>
+      <w:r>
+        <w:drawing>
+          <wp:inline>
+            <wp:extent cx="4267200" cy="2824540"/>
+            <wp:effectExtent b="0" l="0" r="0" t="0"/>
+            <wp:docPr descr="image" title="" id="31" name="Picture"/>
+            <a:graphic>
+              <a:graphicData uri="http://schemas.openxmlformats.org/drawingml/2006/picture">
+                <pic:pic>
+                  <pic:nvPicPr>
+                    <pic:cNvPr descr="media/supplements1/exercise1/grafica_b.png" id="32" name="Picture"/>
+                    <pic:cNvPicPr>
+                      <a:picLocks noChangeArrowheads="1" noChangeAspect="1"/>
+                    </pic:cNvPicPr>
+                  </pic:nvPicPr>
+                  <pic:blipFill>
+                    <a:blip r:embed="rId30"/>
+                    <a:stretch>
+                      <a:fillRect/>
+                    </a:stretch>
+                  </pic:blipFill>
+                  <pic:spPr bwMode="auto">
+                    <a:xfrm>
+                      <a:off x="0" y="0"/>
+                      <a:ext cx="4267200" cy="2824540"/>
+                    </a:xfrm>
+                    <a:prstGeom prst="rect">
+                      <a:avLst/>
+                    </a:prstGeom>
+                    <a:noFill/>
+                    <a:ln w="9525">
+                      <a:noFill/>
+                      <a:headEnd/>
+                      <a:tailEnd/>
+                    </a:ln>
+                  </pic:spPr>
+                </pic:pic>
+              </a:graphicData>
+            </a:graphic>
+          </wp:inline>
+        </w:drawing>
+      </w:r>
+    </w:p>
+    <w:p>
+      <w:pPr>
+        <w:numPr>
+          <w:ilvl w:val="1"/>
+          <w:numId w:val="1002"/>
+        </w:numPr>
+      </w:pPr>
+      <w:r>
+        <w:drawing>
+          <wp:inline>
+            <wp:extent cx="3733800" cy="3712776"/>
+            <wp:effectExtent b="0" l="0" r="0" t="0"/>
+            <wp:docPr descr="image" title="" id="34" name="Picture"/>
+            <a:graphic>
+              <a:graphicData uri="http://schemas.openxmlformats.org/drawingml/2006/picture">
+                <pic:pic>
+                  <pic:nvPicPr>
+                    <pic:cNvPr descr="media/supplements1/exercise1/grafica_a.png" id="35" name="Picture"/>
+                    <pic:cNvPicPr>
+                      <a:picLocks noChangeArrowheads="1" noChangeAspect="1"/>
+                    </pic:cNvPicPr>
+                  </pic:nvPicPr>
+                  <pic:blipFill>
+                    <a:blip r:embed="rId33"/>
+                    <a:stretch>
+                      <a:fillRect/>
+                    </a:stretch>
+                  </pic:blipFill>
+                  <pic:spPr bwMode="auto">
+                    <a:xfrm>
+                      <a:off x="0" y="0"/>
+                      <a:ext cx="3733800" cy="3712776"/>
+                    </a:xfrm>
+                    <a:prstGeom prst="rect">
+                      <a:avLst/>
+                    </a:prstGeom>
+                    <a:noFill/>
+                    <a:ln w="9525">
+                      <a:noFill/>
+                      <a:headEnd/>
+                      <a:tailEnd/>
+                    </a:ln>
+                  </pic:spPr>
+                </pic:pic>
+              </a:graphicData>
+            </a:graphic>
+          </wp:inline>
+        </w:drawing>
+      </w:r>
+    </w:p>
+    <w:p>
+      <w:pPr>
+        <w:numPr>
           <w:ilvl w:val="0"/>
           <w:numId w:val="1000"/>
-        </w:numPr>
-      </w:pPr>
-      <w:r>
-        <w:t xml:space="preserve">Si la persona quiere realizar una comparación entre los gastos totales por semana, ¿cuál de las siguientes gráficas le permite hacer esto directamente?</w:t>
-      </w:r>
-    </w:p>
-    <w:p>
-      <w:pPr>
-        <w:numPr>
-          <w:ilvl w:val="0"/>
-          <w:numId w:val="1001"/>
         </w:numPr>
       </w:pPr>
       <w:r>
@@ -1322,11 +452,11 @@
           <w:numId w:val="1000"/>
         </w:numPr>
       </w:pPr>
-      <w:bookmarkStart w:id="38" w:name="anuxe1lisis-de-los-datos"/>
+      <w:bookmarkStart w:id="36" w:name="anuxe1lisis-de-los-datos"/>
       <w:r>
         <w:t xml:space="preserve">Análisis de los datos</w:t>
       </w:r>
-      <w:bookmarkEnd w:id="38"/>
+      <w:bookmarkEnd w:id="36"/>
     </w:p>
     <w:p>
       <w:pPr>
@@ -1343,7 +473,7 @@
       <w:pPr>
         <w:numPr>
           <w:ilvl w:val="1"/>
-          <w:numId w:val="1017"/>
+          <w:numId w:val="1003"/>
         </w:numPr>
       </w:pPr>
       <w:r>
@@ -1357,14 +487,14 @@
         <w:t xml:space="preserve"> </w:t>
       </w:r>
       <w:r>
-        <w:t xml:space="preserve">$38.000 + $17.000 + $9.000 = $64.000</w:t>
+        <w:t xml:space="preserve">$25.000 + $18.000 + $14.000 = $57.000</w:t>
       </w:r>
     </w:p>
     <w:p>
       <w:pPr>
         <w:numPr>
           <w:ilvl w:val="1"/>
-          <w:numId w:val="1017"/>
+          <w:numId w:val="1003"/>
         </w:numPr>
       </w:pPr>
       <w:r>
@@ -1378,14 +508,14 @@
         <w:t xml:space="preserve"> </w:t>
       </w:r>
       <w:r>
-        <w:t xml:space="preserve">$26.000 + $24.000 + $18.000 = $68.000</w:t>
+        <w:t xml:space="preserve">$33.000 + $19.000 + $23.000 = $75.000</w:t>
       </w:r>
     </w:p>
     <w:p>
       <w:pPr>
         <w:numPr>
           <w:ilvl w:val="1"/>
-          <w:numId w:val="1017"/>
+          <w:numId w:val="1003"/>
         </w:numPr>
       </w:pPr>
       <w:r>
@@ -1399,14 +529,14 @@
         <w:t xml:space="preserve"> </w:t>
       </w:r>
       <w:r>
-        <w:t xml:space="preserve">$30.000 + $27.000 + $10.000 = $67.000</w:t>
+        <w:t xml:space="preserve">$33.000 + $21.000 + $19.000 = $73.000</w:t>
       </w:r>
     </w:p>
     <w:p>
       <w:pPr>
         <w:numPr>
           <w:ilvl w:val="1"/>
-          <w:numId w:val="1017"/>
+          <w:numId w:val="1003"/>
         </w:numPr>
       </w:pPr>
       <w:r>
@@ -1420,7 +550,7 @@
         <w:t xml:space="preserve"> </w:t>
       </w:r>
       <w:r>
-        <w:t xml:space="preserve">$40.000 + $19.000 + $15.000 = $74.000</w:t>
+        <w:t xml:space="preserve">$38.000 + $19.000 + $15.000 = $72.000</w:t>
       </w:r>
     </w:p>
     <w:p>
@@ -1431,11 +561,11 @@
           <w:numId w:val="1000"/>
         </w:numPr>
       </w:pPr>
-      <w:bookmarkStart w:id="39" w:name="anuxe1lisis-de-cada-opciuxf3n"/>
+      <w:bookmarkStart w:id="37" w:name="anuxe1lisis-de-cada-opciuxf3n"/>
       <w:r>
         <w:t xml:space="preserve">Análisis de cada opción</w:t>
       </w:r>
-      <w:bookmarkEnd w:id="39"/>
+      <w:bookmarkEnd w:id="37"/>
     </w:p>
     <w:p>
       <w:pPr>
@@ -1456,7 +586,7 @@
       <w:pPr>
         <w:numPr>
           <w:ilvl w:val="1"/>
-          <w:numId w:val="1018"/>
+          <w:numId w:val="1004"/>
         </w:numPr>
       </w:pPr>
       <w:r>
@@ -1467,7 +597,7 @@
       <w:pPr>
         <w:numPr>
           <w:ilvl w:val="1"/>
-          <w:numId w:val="1018"/>
+          <w:numId w:val="1004"/>
         </w:numPr>
       </w:pPr>
       <w:r>
@@ -1493,7 +623,7 @@
       <w:pPr>
         <w:numPr>
           <w:ilvl w:val="1"/>
-          <w:numId w:val="1019"/>
+          <w:numId w:val="1005"/>
         </w:numPr>
       </w:pPr>
       <w:r>
@@ -1504,7 +634,7 @@
       <w:pPr>
         <w:numPr>
           <w:ilvl w:val="1"/>
-          <w:numId w:val="1019"/>
+          <w:numId w:val="1005"/>
         </w:numPr>
       </w:pPr>
       <w:r>
@@ -1515,7 +645,7 @@
       <w:pPr>
         <w:numPr>
           <w:ilvl w:val="1"/>
-          <w:numId w:val="1019"/>
+          <w:numId w:val="1005"/>
         </w:numPr>
       </w:pPr>
       <w:r>
@@ -1526,7 +656,7 @@
       <w:pPr>
         <w:numPr>
           <w:ilvl w:val="1"/>
-          <w:numId w:val="1019"/>
+          <w:numId w:val="1005"/>
         </w:numPr>
       </w:pPr>
       <w:r>
@@ -1556,7 +686,7 @@
       <w:pPr>
         <w:numPr>
           <w:ilvl w:val="1"/>
-          <w:numId w:val="1020"/>
+          <w:numId w:val="1006"/>
         </w:numPr>
       </w:pPr>
       <w:r>
@@ -1567,7 +697,7 @@
       <w:pPr>
         <w:numPr>
           <w:ilvl w:val="1"/>
-          <w:numId w:val="1020"/>
+          <w:numId w:val="1006"/>
         </w:numPr>
       </w:pPr>
       <w:r>
@@ -1593,7 +723,7 @@
       <w:pPr>
         <w:numPr>
           <w:ilvl w:val="1"/>
-          <w:numId w:val="1021"/>
+          <w:numId w:val="1007"/>
         </w:numPr>
       </w:pPr>
       <w:r>
@@ -1604,7 +734,7 @@
       <w:pPr>
         <w:numPr>
           <w:ilvl w:val="1"/>
-          <w:numId w:val="1021"/>
+          <w:numId w:val="1007"/>
         </w:numPr>
       </w:pPr>
       <w:r>
@@ -1619,11 +749,11 @@
           <w:numId w:val="1000"/>
         </w:numPr>
       </w:pPr>
-      <w:bookmarkStart w:id="40" w:name="conclusiuxf3n"/>
+      <w:bookmarkStart w:id="38" w:name="conclusiuxf3n"/>
       <w:r>
         <w:t xml:space="preserve">Conclusión</w:t>
       </w:r>
-      <w:bookmarkEnd w:id="40"/>
+      <w:bookmarkEnd w:id="38"/>
     </w:p>
     <w:p>
       <w:pPr>
@@ -1684,7 +814,29 @@
       <w:pPr>
         <w:numPr>
           <w:ilvl w:val="1"/>
-          <w:numId w:val="1022"/>
+          <w:numId w:val="1008"/>
+        </w:numPr>
+      </w:pPr>
+      <w:r>
+        <w:t xml:space="preserve">Falso</w:t>
+      </w:r>
+    </w:p>
+    <w:p>
+      <w:pPr>
+        <w:numPr>
+          <w:ilvl w:val="1"/>
+          <w:numId w:val="1008"/>
+        </w:numPr>
+      </w:pPr>
+      <w:r>
+        <w:t xml:space="preserve">Falso</w:t>
+      </w:r>
+    </w:p>
+    <w:p>
+      <w:pPr>
+        <w:numPr>
+          <w:ilvl w:val="1"/>
+          <w:numId w:val="1008"/>
         </w:numPr>
       </w:pPr>
       <w:r>
@@ -1695,36 +847,14 @@
       <w:pPr>
         <w:numPr>
           <w:ilvl w:val="1"/>
-          <w:numId w:val="1022"/>
+          <w:numId w:val="1008"/>
         </w:numPr>
       </w:pPr>
       <w:r>
         <w:t xml:space="preserve">Falso</w:t>
       </w:r>
     </w:p>
-    <w:p>
-      <w:pPr>
-        <w:numPr>
-          <w:ilvl w:val="1"/>
-          <w:numId w:val="1022"/>
-        </w:numPr>
-      </w:pPr>
-      <w:r>
-        <w:t xml:space="preserve">Falso</w:t>
-      </w:r>
-    </w:p>
-    <w:p>
-      <w:pPr>
-        <w:numPr>
-          <w:ilvl w:val="1"/>
-          <w:numId w:val="1022"/>
-        </w:numPr>
-      </w:pPr>
-      <w:r>
-        <w:t xml:space="preserve">Falso</w:t>
-      </w:r>
-    </w:p>
-    <w:bookmarkEnd w:id="41"/>
+    <w:bookmarkEnd w:id="39"/>
     <w:sectPr/>
   </w:body>
 </w:document>
@@ -2071,156 +1201,6 @@
     <w:abstractNumId w:val="991"/>
   </w:num>
   <w:num w:numId="1008">
-    <w:abstractNumId w:val="99201"/>
-    <w:lvlOverride w:ilvl="0">
-      <w:startOverride w:val="1"/>
-    </w:lvlOverride>
-    <w:lvlOverride w:ilvl="1">
-      <w:startOverride w:val="1"/>
-    </w:lvlOverride>
-    <w:lvlOverride w:ilvl="2">
-      <w:startOverride w:val="1"/>
-    </w:lvlOverride>
-    <w:lvlOverride w:ilvl="3">
-      <w:startOverride w:val="1"/>
-    </w:lvlOverride>
-    <w:lvlOverride w:ilvl="4">
-      <w:startOverride w:val="1"/>
-    </w:lvlOverride>
-    <w:lvlOverride w:ilvl="5">
-      <w:startOverride w:val="1"/>
-    </w:lvlOverride>
-    <w:lvlOverride w:ilvl="6">
-      <w:startOverride w:val="1"/>
-    </w:lvlOverride>
-    <w:lvlOverride w:ilvl="7">
-      <w:startOverride w:val="1"/>
-    </w:lvlOverride>
-    <w:lvlOverride w:ilvl="8">
-      <w:startOverride w:val="1"/>
-    </w:lvlOverride>
-  </w:num>
-  <w:num w:numId="1009">
-    <w:abstractNumId w:val="99201"/>
-    <w:lvlOverride w:ilvl="0">
-      <w:startOverride w:val="1"/>
-    </w:lvlOverride>
-    <w:lvlOverride w:ilvl="1">
-      <w:startOverride w:val="1"/>
-    </w:lvlOverride>
-    <w:lvlOverride w:ilvl="2">
-      <w:startOverride w:val="1"/>
-    </w:lvlOverride>
-    <w:lvlOverride w:ilvl="3">
-      <w:startOverride w:val="1"/>
-    </w:lvlOverride>
-    <w:lvlOverride w:ilvl="4">
-      <w:startOverride w:val="1"/>
-    </w:lvlOverride>
-    <w:lvlOverride w:ilvl="5">
-      <w:startOverride w:val="1"/>
-    </w:lvlOverride>
-    <w:lvlOverride w:ilvl="6">
-      <w:startOverride w:val="1"/>
-    </w:lvlOverride>
-    <w:lvlOverride w:ilvl="7">
-      <w:startOverride w:val="1"/>
-    </w:lvlOverride>
-    <w:lvlOverride w:ilvl="8">
-      <w:startOverride w:val="1"/>
-    </w:lvlOverride>
-  </w:num>
-  <w:num w:numId="1010">
-    <w:abstractNumId w:val="991"/>
-  </w:num>
-  <w:num w:numId="1011">
-    <w:abstractNumId w:val="991"/>
-  </w:num>
-  <w:num w:numId="1012">
-    <w:abstractNumId w:val="991"/>
-  </w:num>
-  <w:num w:numId="1013">
-    <w:abstractNumId w:val="991"/>
-  </w:num>
-  <w:num w:numId="1014">
-    <w:abstractNumId w:val="991"/>
-  </w:num>
-  <w:num w:numId="1015">
-    <w:abstractNumId w:val="99201"/>
-    <w:lvlOverride w:ilvl="0">
-      <w:startOverride w:val="1"/>
-    </w:lvlOverride>
-    <w:lvlOverride w:ilvl="1">
-      <w:startOverride w:val="1"/>
-    </w:lvlOverride>
-    <w:lvlOverride w:ilvl="2">
-      <w:startOverride w:val="1"/>
-    </w:lvlOverride>
-    <w:lvlOverride w:ilvl="3">
-      <w:startOverride w:val="1"/>
-    </w:lvlOverride>
-    <w:lvlOverride w:ilvl="4">
-      <w:startOverride w:val="1"/>
-    </w:lvlOverride>
-    <w:lvlOverride w:ilvl="5">
-      <w:startOverride w:val="1"/>
-    </w:lvlOverride>
-    <w:lvlOverride w:ilvl="6">
-      <w:startOverride w:val="1"/>
-    </w:lvlOverride>
-    <w:lvlOverride w:ilvl="7">
-      <w:startOverride w:val="1"/>
-    </w:lvlOverride>
-    <w:lvlOverride w:ilvl="8">
-      <w:startOverride w:val="1"/>
-    </w:lvlOverride>
-  </w:num>
-  <w:num w:numId="1016">
-    <w:abstractNumId w:val="99201"/>
-    <w:lvlOverride w:ilvl="0">
-      <w:startOverride w:val="1"/>
-    </w:lvlOverride>
-    <w:lvlOverride w:ilvl="1">
-      <w:startOverride w:val="1"/>
-    </w:lvlOverride>
-    <w:lvlOverride w:ilvl="2">
-      <w:startOverride w:val="1"/>
-    </w:lvlOverride>
-    <w:lvlOverride w:ilvl="3">
-      <w:startOverride w:val="1"/>
-    </w:lvlOverride>
-    <w:lvlOverride w:ilvl="4">
-      <w:startOverride w:val="1"/>
-    </w:lvlOverride>
-    <w:lvlOverride w:ilvl="5">
-      <w:startOverride w:val="1"/>
-    </w:lvlOverride>
-    <w:lvlOverride w:ilvl="6">
-      <w:startOverride w:val="1"/>
-    </w:lvlOverride>
-    <w:lvlOverride w:ilvl="7">
-      <w:startOverride w:val="1"/>
-    </w:lvlOverride>
-    <w:lvlOverride w:ilvl="8">
-      <w:startOverride w:val="1"/>
-    </w:lvlOverride>
-  </w:num>
-  <w:num w:numId="1017">
-    <w:abstractNumId w:val="991"/>
-  </w:num>
-  <w:num w:numId="1018">
-    <w:abstractNumId w:val="991"/>
-  </w:num>
-  <w:num w:numId="1019">
-    <w:abstractNumId w:val="991"/>
-  </w:num>
-  <w:num w:numId="1020">
-    <w:abstractNumId w:val="991"/>
-  </w:num>
-  <w:num w:numId="1021">
-    <w:abstractNumId w:val="991"/>
-  </w:num>
-  <w:num w:numId="1022">
     <w:abstractNumId w:val="99201"/>
     <w:lvlOverride w:ilvl="0">
       <w:startOverride w:val="1"/>

</xml_diff>